<commit_message>
15 - materialy zrodlowe z rundy feedbacku 2026-09-04
Nowy folder 'Warsztaty LDIT - 20260904' (Makieta + Bot.docx, Etapy_procesu.png,
notatka ze spotkania 04.09). Aktualizacja 'Prowizja liczenie.xlsx' i spisu
funkcji od Bartka. Zamyka niezacommitowane zmiany, working tree czysty.

Co-Authored-By: Claude Opus 4.8 (1M context) <noreply@anthropic.com>
</commit_message>
<xml_diff>
--- a/Warsztat LDIT - 20260825/Od Bartka - spis funkcji .docx
+++ b/Warsztat LDIT - 20260825/Od Bartka - spis funkcji .docx
@@ -78,7 +78,6 @@
         <w:pStyle w:val="Akapitzlist"/>
         <w:ind w:left="1080"/>
       </w:pPr>
-      <w:proofErr w:type="gramStart"/>
       <w:r>
         <w:rPr>
           <w:b/>
@@ -87,23 +86,7 @@
         <w:t>Pracownik</w:t>
       </w:r>
       <w:r>
-        <w:t xml:space="preserve"> </w:t>
-      </w:r>
-      <w:r>
-        <w:t xml:space="preserve"> </w:t>
-      </w:r>
-      <w:r>
-        <w:t>menager</w:t>
-      </w:r>
-      <w:proofErr w:type="gramEnd"/>
-      <w:r>
-        <w:t xml:space="preserve">– </w:t>
-      </w:r>
-      <w:r>
-        <w:t xml:space="preserve">widzi więcej, </w:t>
-      </w:r>
-      <w:r>
-        <w:t xml:space="preserve">dostęp do przypisanych klientów, zależnie od uprawnień. </w:t>
+        <w:t xml:space="preserve"> – dostęp do przypisanych klientów, zależnie od uprawnień. </w:t>
       </w:r>
     </w:p>
     <w:p>
@@ -111,22 +94,22 @@
         <w:pStyle w:val="Akapitzlist"/>
         <w:ind w:left="1080"/>
       </w:pPr>
-      <w:r>
-        <w:rPr>
-          <w:b/>
-          <w:bCs/>
-        </w:rPr>
-        <w:t>Pracownik</w:t>
-      </w:r>
-      <w:r>
-        <w:t xml:space="preserve"> – dostęp do przypisanych klientów, zależnie od uprawnień. </w:t>
-      </w:r>
     </w:p>
     <w:p>
       <w:pPr>
         <w:pStyle w:val="Akapitzlist"/>
         <w:ind w:left="1080"/>
       </w:pPr>
+      <w:r>
+        <w:rPr>
+          <w:b/>
+          <w:bCs/>
+        </w:rPr>
+        <w:t>Instytucja szkoleniowa</w:t>
+      </w:r>
+      <w:r>
+        <w:t xml:space="preserve"> – wyłącznie klienci przypisani do tej konkretnej IS. </w:t>
+      </w:r>
     </w:p>
     <w:p>
       <w:pPr>
@@ -138,10 +121,7 @@
           <w:b/>
           <w:bCs/>
         </w:rPr>
-        <w:t>Instytucja szkoleniowa</w:t>
-      </w:r>
-      <w:r>
-        <w:t xml:space="preserve"> – wyłącznie klienci przypisani do tej konkretnej IS. </w:t>
+        <w:t xml:space="preserve">Administrator instytucji </w:t>
       </w:r>
     </w:p>
     <w:p>
@@ -253,25 +233,9 @@
       <w:pPr>
         <w:pStyle w:val="Akapitzlist"/>
         <w:ind w:left="1080"/>
-        <w:jc w:val="center"/>
-        <w:rPr>
-          <w:b/>
-          <w:bCs/>
-        </w:rPr>
-      </w:pPr>
-      <w:r>
-        <w:rPr>
-          <w:b/>
-          <w:bCs/>
-        </w:rPr>
-        <w:t>Terminy i automatyczne a</w:t>
-      </w:r>
-      <w:r>
-        <w:rPr>
-          <w:b/>
-          <w:bCs/>
-        </w:rPr>
-        <w:t>lerty</w:t>
+      </w:pPr>
+      <w:r>
+        <w:t xml:space="preserve">Powiadomienia dla pracowników – </w:t>
       </w:r>
     </w:p>
     <w:p>
@@ -279,191 +243,237 @@
         <w:pStyle w:val="Akapitzlist"/>
         <w:ind w:left="1080"/>
       </w:pPr>
-      <w:r>
-        <w:rPr>
-          <w:b/>
-          <w:bCs/>
-        </w:rPr>
-        <w:t>Ręczne ustawianie alertów</w:t>
-      </w:r>
-      <w:r>
-        <w:t xml:space="preserve"> </w:t>
-      </w:r>
-      <w:r>
-        <w:t>–</w:t>
-      </w:r>
-      <w:r>
-        <w:t xml:space="preserve"> </w:t>
-      </w:r>
-      <w:r>
-        <w:t>administrator oraz pracownicy mogą ustawić alert samodzielnie np. po przeczytaniu</w:t>
-      </w:r>
-      <w:r>
-        <w:t xml:space="preserve"> umowy okazało się, że Klient 7 dni przed rozpoczęciem szkolenia musi dostarczyć harmonogram </w:t>
-      </w:r>
-      <w:r>
-        <w:t>–</w:t>
-      </w:r>
-      <w:r>
-        <w:t xml:space="preserve"> wtedy</w:t>
-      </w:r>
-      <w:r>
-        <w:t xml:space="preserve"> ustawiamy </w:t>
-      </w:r>
-      <w:r>
-        <w:t>datę,</w:t>
-      </w:r>
-      <w:r>
-        <w:t xml:space="preserve"> </w:t>
-      </w:r>
-      <w:r>
-        <w:t xml:space="preserve">kiedy chcemy </w:t>
-      </w:r>
-      <w:r>
-        <w:t xml:space="preserve">otrzymać </w:t>
-      </w:r>
-      <w:r>
-        <w:t>alert</w:t>
-      </w:r>
-      <w:r>
-        <w:t xml:space="preserve"> i o co chodzi.</w:t>
-      </w:r>
     </w:p>
     <w:p>
       <w:pPr>
         <w:pStyle w:val="Akapitzlist"/>
         <w:ind w:left="1080"/>
       </w:pPr>
-      <w:r>
-        <w:rPr>
-          <w:b/>
-          <w:bCs/>
-        </w:rPr>
-        <w:t>Automatyczne ustaw</w:t>
-      </w:r>
-      <w:r>
-        <w:rPr>
-          <w:b/>
-          <w:bCs/>
-        </w:rPr>
-        <w:t xml:space="preserve">ianie alertów </w:t>
-      </w:r>
-      <w:r>
-        <w:t>–</w:t>
-      </w:r>
-      <w:r>
-        <w:t xml:space="preserve"> </w:t>
-      </w:r>
-      <w:r>
-        <w:t>otrzymujemy alert mailowy</w:t>
-      </w:r>
-      <w:r>
-        <w:t xml:space="preserve"> od praca.gov.pl </w:t>
-      </w:r>
-      <w:r>
-        <w:t xml:space="preserve">w sprawie Klienta, u którego jesteśmy w organizacji. </w:t>
-      </w:r>
-      <w:r>
-        <w:t>Może zdarzyć się, że Klient nie odbierze telefonu przez co musimy ustawić maila jako nieodczytane lub of</w:t>
-      </w:r>
-      <w:r>
-        <w:t>lagować, żeby nam nie umknęło.</w:t>
-      </w:r>
-      <w:r>
-        <w:t xml:space="preserve"> Chciałbym, żeby</w:t>
-      </w:r>
-      <w:r>
-        <w:t xml:space="preserve"> alert był jako zadanie? Wykrzyknik przy Kliencie? Do przemyślenia jak zrobić to najl</w:t>
-      </w:r>
-      <w:r>
-        <w:t>epiej.</w:t>
-      </w:r>
     </w:p>
     <w:p>
       <w:pPr>
         <w:pStyle w:val="Akapitzlist"/>
         <w:ind w:left="1080"/>
       </w:pPr>
-      <w:r>
-        <w:rPr>
-          <w:b/>
-          <w:bCs/>
-        </w:rPr>
-        <w:t>Alerty</w:t>
-      </w:r>
-      <w:r>
-        <w:rPr>
-          <w:b/>
-          <w:bCs/>
-        </w:rPr>
-        <w:t xml:space="preserve"> „kiedy wystawić fakturę” </w:t>
-      </w:r>
-      <w:r>
-        <w:t>– Alert dla administratora</w:t>
-      </w:r>
-      <w:r>
-        <w:t xml:space="preserve"> lub docelowo dla osoby odpowiedzialnej za wystawianie faktur</w:t>
-      </w:r>
-      <w:r>
-        <w:t xml:space="preserve">, więc </w:t>
-      </w:r>
-      <w:proofErr w:type="gramStart"/>
-      <w:r>
-        <w:t>admin</w:t>
-      </w:r>
-      <w:proofErr w:type="gramEnd"/>
-      <w:r>
-        <w:t xml:space="preserve"> powinien mieć też opcję kto może otrzymywać</w:t>
-      </w:r>
-      <w:r>
-        <w:t>,</w:t>
-      </w:r>
-      <w:r>
-        <w:t xml:space="preserve"> jakie alerty. Np. zdecyduję, że za tydzień pracownik wystawia faktury, więc chcę mieć opcję nadania mu uprawnienia do otrzymywania </w:t>
-      </w:r>
-      <w:r>
-        <w:t xml:space="preserve">alertów </w:t>
-      </w:r>
-      <w:proofErr w:type="spellStart"/>
-      <w:r>
-        <w:t>dt</w:t>
-      </w:r>
-      <w:proofErr w:type="spellEnd"/>
-      <w:r>
-        <w:t xml:space="preserve">. </w:t>
-      </w:r>
-      <w:r>
-        <w:t>f</w:t>
-      </w:r>
-      <w:r>
-        <w:t>aktur. Faktura jest wystawiana w momencie wystawienia faktury przez Instytucję Szkoleniową</w:t>
-      </w:r>
-      <w:r>
-        <w:t xml:space="preserve">, więc tutaj </w:t>
-      </w:r>
-      <w:r>
-        <w:t xml:space="preserve">alert powinien być przesłany w momencie zaznaczenia </w:t>
-      </w:r>
-      <w:proofErr w:type="spellStart"/>
-      <w:r>
-        <w:t>checkboxa</w:t>
-      </w:r>
-      <w:proofErr w:type="spellEnd"/>
-      <w:r>
-        <w:t xml:space="preserve"> przez pracownika, że IS wystawiła fakturę.</w:t>
-      </w:r>
     </w:p>
     <w:p>
       <w:pPr>
         <w:pStyle w:val="Akapitzlist"/>
         <w:ind w:left="1080"/>
-      </w:pPr>
-      <w:r>
-        <w:rPr>
-          <w:b/>
-          <w:bCs/>
-        </w:rPr>
+        <w:jc w:val="center"/>
+        <w:rPr>
+          <w:b/>
+          <w:bCs/>
+        </w:rPr>
+      </w:pPr>
+      <w:r>
+        <w:rPr>
+          <w:b/>
+          <w:bCs/>
+        </w:rPr>
+        <w:t>Terminy i automatyczne a</w:t>
+      </w:r>
+      <w:r>
+        <w:rPr>
+          <w:b/>
+          <w:bCs/>
+        </w:rPr>
+        <w:t>lerty</w:t>
+      </w:r>
+    </w:p>
+    <w:p>
+      <w:pPr>
+        <w:pStyle w:val="Akapitzlist"/>
+        <w:ind w:left="1080"/>
+      </w:pPr>
+      <w:r>
+        <w:rPr>
+          <w:b/>
+          <w:bCs/>
+        </w:rPr>
+        <w:t>Ręczne ustawianie alertów</w:t>
+      </w:r>
+      <w:r>
+        <w:t xml:space="preserve"> </w:t>
+      </w:r>
+      <w:r>
+        <w:t>–</w:t>
+      </w:r>
+      <w:r>
+        <w:t xml:space="preserve"> </w:t>
+      </w:r>
+      <w:r>
+        <w:t>administrator oraz pracownicy mogą ustawić alert samodzielnie np. po przeczytaniu</w:t>
+      </w:r>
+      <w:r>
+        <w:t xml:space="preserve"> umowy okazało się, że Klient 7 dni przed rozpoczęciem szkolenia musi dostarczyć harmonogram </w:t>
+      </w:r>
+      <w:r>
+        <w:t>–</w:t>
+      </w:r>
+      <w:r>
+        <w:t xml:space="preserve"> wtedy</w:t>
+      </w:r>
+      <w:r>
+        <w:t xml:space="preserve"> ustawiamy </w:t>
+      </w:r>
+      <w:r>
+        <w:t>datę,</w:t>
+      </w:r>
+      <w:r>
+        <w:t xml:space="preserve"> </w:t>
+      </w:r>
+      <w:r>
+        <w:t xml:space="preserve">kiedy chcemy </w:t>
+      </w:r>
+      <w:r>
+        <w:t xml:space="preserve">otrzymać </w:t>
+      </w:r>
+      <w:r>
+        <w:t>alert</w:t>
+      </w:r>
+      <w:r>
+        <w:t xml:space="preserve"> i o co chodzi.</w:t>
+      </w:r>
+    </w:p>
+    <w:p>
+      <w:pPr>
+        <w:pStyle w:val="Akapitzlist"/>
+        <w:ind w:left="1080"/>
+      </w:pPr>
+      <w:r>
+        <w:rPr>
+          <w:b/>
+          <w:bCs/>
+        </w:rPr>
+        <w:t>Automatyczne ustaw</w:t>
+      </w:r>
+      <w:r>
+        <w:rPr>
+          <w:b/>
+          <w:bCs/>
+        </w:rPr>
+        <w:t xml:space="preserve">ianie alertów </w:t>
+      </w:r>
+      <w:r>
+        <w:t>–</w:t>
+      </w:r>
+      <w:r>
+        <w:t xml:space="preserve"> </w:t>
+      </w:r>
+      <w:r>
+        <w:t>otrzymujemy alert mailowy</w:t>
+      </w:r>
+      <w:r>
+        <w:t xml:space="preserve"> od praca.gov.pl </w:t>
+      </w:r>
+      <w:r>
+        <w:t xml:space="preserve">w sprawie Klienta, u którego jesteśmy w organizacji. </w:t>
+      </w:r>
+      <w:r>
+        <w:t>Może zdarzyć się, że Klient nie odbierze telefonu przez co musimy ustawić maila jako nieodczytane lub of</w:t>
+      </w:r>
+      <w:r>
+        <w:t>lagować, żeby nam nie umknęło.</w:t>
+      </w:r>
+      <w:r>
+        <w:t xml:space="preserve"> Chciałbym, żeby</w:t>
+      </w:r>
+      <w:r>
+        <w:t xml:space="preserve"> alert był jako zadanie? Wykrzyknik przy Kliencie? Do przemyślenia jak zrobić to najl</w:t>
+      </w:r>
+      <w:r>
+        <w:t>epiej.</w:t>
+      </w:r>
+    </w:p>
+    <w:p>
+      <w:pPr>
+        <w:pStyle w:val="Akapitzlist"/>
+        <w:ind w:left="1080"/>
+      </w:pPr>
+      <w:r>
+        <w:rPr>
+          <w:b/>
+          <w:bCs/>
+        </w:rPr>
+        <w:t>Alerty</w:t>
+      </w:r>
+      <w:r>
+        <w:rPr>
+          <w:b/>
+          <w:bCs/>
+        </w:rPr>
+        <w:t xml:space="preserve"> „kiedy wystawić fakturę” </w:t>
+      </w:r>
+      <w:r>
+        <w:t>– Alert dla administratora</w:t>
+      </w:r>
+      <w:r>
+        <w:t xml:space="preserve"> lub docelowo dla osoby odpowiedzialnej za wystawianie faktur</w:t>
+      </w:r>
+      <w:r>
+        <w:t xml:space="preserve">, więc </w:t>
+      </w:r>
+      <w:proofErr w:type="gramStart"/>
+      <w:r>
+        <w:t>admin</w:t>
+      </w:r>
+      <w:proofErr w:type="gramEnd"/>
+      <w:r>
+        <w:t xml:space="preserve"> powinien mieć też opcję kto może otrzymywać</w:t>
+      </w:r>
+      <w:r>
+        <w:t>,</w:t>
+      </w:r>
+      <w:r>
+        <w:t xml:space="preserve"> jakie alerty. Np. zdecyduję, że za tydzień pracownik wystawia faktury, więc chcę mieć opcję nadania mu uprawnienia do otrzymywania </w:t>
+      </w:r>
+      <w:r>
+        <w:t xml:space="preserve">alertów </w:t>
+      </w:r>
+      <w:proofErr w:type="spellStart"/>
+      <w:r>
+        <w:t>dt</w:t>
+      </w:r>
+      <w:proofErr w:type="spellEnd"/>
+      <w:r>
+        <w:t xml:space="preserve">. </w:t>
+      </w:r>
+      <w:r>
+        <w:t>f</w:t>
+      </w:r>
+      <w:r>
+        <w:t xml:space="preserve">aktur. Faktura jest wystawiana w momencie </w:t>
+      </w:r>
+      <w:r>
         <w:lastRenderedPageBreak/>
+        <w:t>wystawienia faktury przez Instytucję Szkoleniową</w:t>
+      </w:r>
+      <w:r>
+        <w:t xml:space="preserve">, więc tutaj </w:t>
+      </w:r>
+      <w:r>
+        <w:t xml:space="preserve">alert powinien być przesłany w momencie zaznaczenia </w:t>
+      </w:r>
+      <w:proofErr w:type="spellStart"/>
+      <w:r>
+        <w:t>checkboxa</w:t>
+      </w:r>
+      <w:proofErr w:type="spellEnd"/>
+      <w:r>
+        <w:t xml:space="preserve"> przez pracownika, że IS wystawiła fakturę.</w:t>
+      </w:r>
+    </w:p>
+    <w:p>
+      <w:pPr>
+        <w:pStyle w:val="Akapitzlist"/>
+        <w:ind w:left="1080"/>
+      </w:pPr>
+      <w:r>
+        <w:rPr>
+          <w:b/>
+          <w:bCs/>
+        </w:rPr>
         <w:t xml:space="preserve">Alerty – terminy szkoleń – </w:t>
       </w:r>
       <w:r>
@@ -4291,6 +4301,15 @@
 </file>
 
 <file path=customXml/item1.xml><?xml version="1.0" encoding="utf-8"?>
+<?mso-contentType ?>
+<FormTemplates xmlns="http://schemas.microsoft.com/sharepoint/v3/contenttype/forms">
+  <Display>DocumentLibraryForm</Display>
+  <Edit>DocumentLibraryForm</Edit>
+  <New>DocumentLibraryForm</New>
+</FormTemplates>
+</file>
+
+<file path=customXml/item2.xml><?xml version="1.0" encoding="utf-8"?>
 <p:properties xmlns:p="http://schemas.microsoft.com/office/2006/metadata/properties" xmlns:xsi="http://www.w3.org/2001/XMLSchema-instance" xmlns:pc="http://schemas.microsoft.com/office/infopath/2007/PartnerControls">
   <documentManagement>
     <TaxCatchAll xmlns="ba0ed539-3bb3-4a9d-81be-d9892850de1a" xsi:nil="true"/>
@@ -4299,15 +4318,6 @@
     </lcf76f155ced4ddcb4097134ff3c332f>
   </documentManagement>
 </p:properties>
-</file>
-
-<file path=customXml/item2.xml><?xml version="1.0" encoding="utf-8"?>
-<?mso-contentType ?>
-<FormTemplates xmlns="http://schemas.microsoft.com/sharepoint/v3/contenttype/forms">
-  <Display>DocumentLibraryForm</Display>
-  <Edit>DocumentLibraryForm</Edit>
-  <New>DocumentLibraryForm</New>
-</FormTemplates>
 </file>
 
 <file path=customXml/item3.xml><?xml version="1.0" encoding="utf-8"?>
@@ -4506,20 +4516,20 @@
 </file>
 
 <file path=customXml/itemProps1.xml><?xml version="1.0" encoding="utf-8"?>
+<ds:datastoreItem xmlns:ds="http://schemas.openxmlformats.org/officeDocument/2006/customXml" ds:itemID="{77CC6E2A-8839-40C7-BCF0-BE037D87C748}">
+  <ds:schemaRefs>
+    <ds:schemaRef ds:uri="http://schemas.microsoft.com/sharepoint/v3/contenttype/forms"/>
+  </ds:schemaRefs>
+</ds:datastoreItem>
+</file>
+
+<file path=customXml/itemProps2.xml><?xml version="1.0" encoding="utf-8"?>
 <ds:datastoreItem xmlns:ds="http://schemas.openxmlformats.org/officeDocument/2006/customXml" ds:itemID="{36210F11-4EC1-4D1B-880D-412ACDC9E7A1}">
   <ds:schemaRefs>
     <ds:schemaRef ds:uri="http://schemas.microsoft.com/office/2006/metadata/properties"/>
     <ds:schemaRef ds:uri="http://schemas.microsoft.com/office/infopath/2007/PartnerControls"/>
     <ds:schemaRef ds:uri="ba0ed539-3bb3-4a9d-81be-d9892850de1a"/>
     <ds:schemaRef ds:uri="5c808c61-7593-4213-a548-41cfd5ff245d"/>
-  </ds:schemaRefs>
-</ds:datastoreItem>
-</file>
-
-<file path=customXml/itemProps2.xml><?xml version="1.0" encoding="utf-8"?>
-<ds:datastoreItem xmlns:ds="http://schemas.openxmlformats.org/officeDocument/2006/customXml" ds:itemID="{77CC6E2A-8839-40C7-BCF0-BE037D87C748}">
-  <ds:schemaRefs>
-    <ds:schemaRef ds:uri="http://schemas.microsoft.com/sharepoint/v3/contenttype/forms"/>
   </ds:schemaRefs>
 </ds:datastoreItem>
 </file>

</xml_diff>